<commit_message>
Clarify that only low-confidence papers route to the labeling UI
Fix a factual imprecision: not every paper reaches the human-verification
UI — only the ones the AI is not confident about. Added one concise
clause in Parts 2 and 3 (EN + TR); softened "every value is checked" and
qualified "verified truth" -> "expert-verified, gold-standard truth".
No change to technical Part 4 or line counts.

Co-Authored-By: Claude Opus 4.8 <noreply@anthropic.com>
</commit_message>
<xml_diff>
--- a/docs/defense/docx/Aysegul_Dogan_Presentation.docx
+++ b/docs/defense/docx/Aysegul_Dogan_Presentation.docx
@@ -792,16 +792,37 @@
         <w:t xml:space="preserve"> </w:t>
       </w:r>
       <w:r>
-        <w:t xml:space="preserve">where each paper passes through progressively more capable (and more expensive) stages, and only the hard cases climb to the costly ones — so it reads at scale without paying top price per paper, and</w:t>
-      </w:r>
-      <w:r>
-        <w:t xml:space="preserve"> </w:t>
-      </w:r>
-      <w:r>
-        <w:rPr>
-          <w:b/>
-        </w:rPr>
-        <w:t xml:space="preserve">every value is checked.</w:t>
+        <w:t xml:space="preserve">where each paper passes through progressively more capable (and more expensive) stages, and only the hard,</w:t>
+      </w:r>
+      <w:r>
+        <w:t xml:space="preserve"> </w:t>
+      </w:r>
+      <w:r>
+        <w:rPr>
+          <w:b/>
+        </w:rPr>
+        <w:t xml:space="preserve">low-confidence</w:t>
+      </w:r>
+      <w:r>
+        <w:t xml:space="preserve"> </w:t>
+      </w:r>
+      <w:r>
+        <w:t xml:space="preserve">cases climb to the costly ones — so it reads at scale without paying top price per paper, and the papers the AI is</w:t>
+      </w:r>
+      <w:r>
+        <w:t xml:space="preserve"> </w:t>
+      </w:r>
+      <w:r>
+        <w:rPr>
+          <w:b/>
+        </w:rPr>
+        <w:t xml:space="preserve">least sure about</w:t>
+      </w:r>
+      <w:r>
+        <w:t xml:space="preserve"> </w:t>
+      </w:r>
+      <w:r>
+        <w:t xml:space="preserve">are the ones that get the most scrutiny (and, at the very top, a human).</w:t>
       </w:r>
     </w:p>
     <w:p>
@@ -1227,7 +1248,22 @@
         <w:t xml:space="preserve"> </w:t>
       </w:r>
       <w:r>
-        <w:t xml:space="preserve">By the time a paper reaches my screen, the AI has already found it, read it, and filled in candidate values. The expert no longer transcribes — they</w:t>
+        <w:t xml:space="preserve">Only the papers where the AI’s confidence is</w:t>
+      </w:r>
+      <w:r>
+        <w:t xml:space="preserve"> </w:t>
+      </w:r>
+      <w:r>
+        <w:rPr>
+          <w:b/>
+        </w:rPr>
+        <w:t xml:space="preserve">low</w:t>
+      </w:r>
+      <w:r>
+        <w:t xml:space="preserve"> </w:t>
+      </w:r>
+      <w:r>
+        <w:t xml:space="preserve">are routed to a human here — the point of the cascade is to spend scarce expert time exactly where the AI is unsure, not on everything. But by the time a paper does reach my screen, the AI has already found it, read it, and filled in candidate values. The expert no longer transcribes — they</w:t>
       </w:r>
       <w:r>
         <w:t xml:space="preserve"> </w:t>
@@ -1338,7 +1374,7 @@
         <w:rPr>
           <w:b/>
         </w:rPr>
-        <w:t xml:space="preserve">It is the only place verified truth — and the training signal — is produced.</w:t>
+        <w:t xml:space="preserve">It is the only place expert-verified, gold-standard truth — and the training signal — is produced.</w:t>
       </w:r>
       <w:r>
         <w:t xml:space="preserve"> </w:t>
@@ -5885,16 +5921,37 @@
         <w:t xml:space="preserve"> </w:t>
       </w:r>
       <w:r>
-        <w:t xml:space="preserve">kullanır ve yalnızca zor vakalar pahalı katmanlara tırmanır — böylece makale başına en yüksek bedeli ödemeden ölçekte okur ve</w:t>
-      </w:r>
-      <w:r>
-        <w:t xml:space="preserve"> </w:t>
-      </w:r>
-      <w:r>
-        <w:rPr>
-          <w:b/>
-        </w:rPr>
-        <w:t xml:space="preserve">her değer kontrol edilir.</w:t>
+        <w:t xml:space="preserve">kullanır ve yalnızca zor,</w:t>
+      </w:r>
+      <w:r>
+        <w:t xml:space="preserve"> </w:t>
+      </w:r>
+      <w:r>
+        <w:rPr>
+          <w:b/>
+        </w:rPr>
+        <w:t xml:space="preserve">düşük-güvenli</w:t>
+      </w:r>
+      <w:r>
+        <w:t xml:space="preserve"> </w:t>
+      </w:r>
+      <w:r>
+        <w:t xml:space="preserve">vakalar pahalı katmanlara tırmanır — böylece makale başına en yüksek bedeli ödemeden ölçekte okur ve yapay zekânın</w:t>
+      </w:r>
+      <w:r>
+        <w:t xml:space="preserve"> </w:t>
+      </w:r>
+      <w:r>
+        <w:rPr>
+          <w:b/>
+        </w:rPr>
+        <w:t xml:space="preserve">en az emin olduğu</w:t>
+      </w:r>
+      <w:r>
+        <w:t xml:space="preserve"> </w:t>
+      </w:r>
+      <w:r>
+        <w:t xml:space="preserve">makaleler en çok incelemeyi alır (ve en tepede bir insan).</w:t>
       </w:r>
     </w:p>
     <w:p>
@@ -6317,7 +6374,22 @@
         <w:t xml:space="preserve"> </w:t>
       </w:r>
       <w:r>
-        <w:t xml:space="preserve">Bir makale benim ekranıma geldiğinde, yapay zekâ onu çoktan bulmuş, okumuş ve aday değerleri doldurmuştur. Uzman artık kopyalamaz — önceden doldurulmuş bir taslağı</w:t>
+        <w:t xml:space="preserve">Yalnızca yapay zekânın güveninin</w:t>
+      </w:r>
+      <w:r>
+        <w:t xml:space="preserve"> </w:t>
+      </w:r>
+      <w:r>
+        <w:rPr>
+          <w:b/>
+        </w:rPr>
+        <w:t xml:space="preserve">düşük</w:t>
+      </w:r>
+      <w:r>
+        <w:t xml:space="preserve"> </w:t>
+      </w:r>
+      <w:r>
+        <w:t xml:space="preserve">olduğu makaleler buraya, bir insana yönlendirilir — kademenin amacı, kıt uzman zamanını her şeye değil, tam olarak yapay zekânın emin olmadığı yere harcamaktır. Ama bir makale ekranıma geldiğinde, yapay zekâ onu çoktan bulmuş, okumuş ve aday değerleri doldurmuştur. Uzman artık kopyalamaz — önceden doldurulmuş bir taslağı</w:t>
       </w:r>
       <w:r>
         <w:t xml:space="preserve"> </w:t>
@@ -6416,7 +6488,7 @@
         <w:rPr>
           <w:b/>
         </w:rPr>
-        <w:t xml:space="preserve">Doğrulanmış gerçeğin — ve eğitim sinyalinin — üretildiği tek yerdir.</w:t>
+        <w:t xml:space="preserve">Uzman-doğrulamalı, altın-standart gerçeğin — ve eğitim sinyalinin — üretildiği tek yerdir.</w:t>
       </w:r>
       <w:r>
         <w:t xml:space="preserve"> </w:t>

</xml_diff>

<commit_message>
Trim Ayşegül presentation Parts 1-3 to the core, drop proposal framing
Ground the pre-technical sections in what the code actually does, not the
TÜBİTAK proposal: remove the L1-L5 / "Layer 5" / "Hybrid Intelligence" /
gold-standard framing everywhere outside the technical Part 4, and cut
Parts 1-3 to just the main ideas — problem (one paragraph), team solution
(three real surfaces: backend pipeline, database, my annotator app), and
my role (verify-a-draft + evidence-highlight, plus the 7-item map into
Part 4). Technical Part 4 and all line counts unchanged. DOCX re-exported.

Co-Authored-By: Claude Opus 4.8 <noreply@anthropic.com>
</commit_message>
<xml_diff>
--- a/docs/defense/docx/Aysegul_Dogan_Presentation.docx
+++ b/docs/defense/docx/Aysegul_Dogan_Presentation.docx
@@ -346,147 +346,34 @@
         <w:t xml:space="preserve"> </w:t>
       </w:r>
       <w:r>
-        <w:t xml:space="preserve">— how much protein, fat, iron or vitamin C a food actually contains — is the backbone of nutrition labels, diet apps, export compliance, clinical nutrition, and public-health policy. The problem is</w:t>
-      </w:r>
-      <w:r>
-        <w:t xml:space="preserve"> </w:t>
-      </w:r>
-      <w:r>
-        <w:rPr>
-          <w:b/>
-        </w:rPr>
-        <w:t xml:space="preserve">how that data is built today.</w:t>
-      </w:r>
-      <w:r>
-        <w:t xml:space="preserve"> </w:t>
-      </w:r>
-      <w:r>
-        <w:t xml:space="preserve">Every reference database the world relies on — USDA’s FoodData Central, the EU’s EFSA, Turkey’s TürKomp — is made the same way:</w:t>
-      </w:r>
-      <w:r>
-        <w:t xml:space="preserve"> </w:t>
-      </w:r>
-      <w:r>
-        <w:rPr>
-          <w:b/>
-        </w:rPr>
-        <w:t xml:space="preserve">human experts transcribe values out of scientific papers by hand, one number at a time.</w:t>
-      </w:r>
-      <w:r>
-        <w:t xml:space="preserve"> </w:t>
-      </w:r>
-      <w:r>
-        <w:t xml:space="preserve">That manual bottleneck makes them</w:t>
-      </w:r>
-      <w:r>
-        <w:t xml:space="preserve"> </w:t>
-      </w:r>
-      <w:r>
-        <w:rPr>
-          <w:b/>
-        </w:rPr>
-        <w:t xml:space="preserve">narrow</w:t>
-      </w:r>
-      <w:r>
-        <w:t xml:space="preserve"> </w:t>
-      </w:r>
-      <w:r>
-        <w:t xml:space="preserve">(only common foods — thousands that appear in the literature are in neither USDA nor EFSA),</w:t>
-      </w:r>
-      <w:r>
-        <w:t xml:space="preserve"> </w:t>
-      </w:r>
-      <w:r>
-        <w:rPr>
-          <w:b/>
-        </w:rPr>
-        <w:t xml:space="preserve">stale</w:t>
-      </w:r>
-      <w:r>
-        <w:t xml:space="preserve"> </w:t>
-      </w:r>
-      <w:r>
-        <w:t xml:space="preserve">(TürKomp has barely moved since 2014), and</w:t>
-      </w:r>
-      <w:r>
-        <w:t xml:space="preserve"> </w:t>
-      </w:r>
-      <w:r>
-        <w:rPr>
-          <w:b/>
-        </w:rPr>
-        <w:t xml:space="preserve">gated</w:t>
-      </w:r>
-      <w:r>
-        <w:t xml:space="preserve"> </w:t>
-      </w:r>
-      <w:r>
-        <w:t xml:space="preserve">(so costly the result is licensed for a fee).</w:t>
-      </w:r>
-    </w:p>
-    <w:p>
-      <w:pPr>
-        <w:pStyle w:val="BodyText"/>
-      </w:pPr>
-      <w:r>
-        <w:t xml:space="preserve">Meanwhile</w:t>
-      </w:r>
-      <w:r>
-        <w:t xml:space="preserve"> </w:t>
-      </w:r>
-      <w:r>
-        <w:rPr>
-          <w:b/>
-        </w:rPr>
-        <w:t xml:space="preserve">the data already exists</w:t>
-      </w:r>
-      <w:r>
-        <w:t xml:space="preserve"> </w:t>
-      </w:r>
-      <w:r>
-        <w:t xml:space="preserve">— published every day in thousands of papers, just locked inside unstructured PDFs full of footnotes, units, and multi-column tables. It isn’t in a database because</w:t>
-      </w:r>
-      <w:r>
-        <w:t xml:space="preserve"> </w:t>
-      </w:r>
-      <w:r>
-        <w:rPr>
-          <w:b/>
-        </w:rPr>
-        <w:t xml:space="preserve">reading it out by hand doesn’t scale</w:t>
-      </w:r>
-      <w:r>
-        <w:t xml:space="preserve"> </w:t>
-      </w:r>
-      <w:r>
-        <w:t xml:space="preserve">— yet the obvious shortcut,</w:t>
-      </w:r>
-      <w:r>
-        <w:t xml:space="preserve"> </w:t>
-      </w:r>
-      <w:r>
-        <w:t xml:space="preserve">“</w:t>
-      </w:r>
-      <w:r>
-        <w:t xml:space="preserve">just let an AI read the papers,</w:t>
-      </w:r>
-      <w:r>
-        <w:t xml:space="preserve">”</w:t>
-      </w:r>
-      <w:r>
-        <w:t xml:space="preserve"> </w:t>
-      </w:r>
-      <w:r>
-        <w:t xml:space="preserve">produces too many wrong numbers, and a wrong value on a food label is worse than none. So the real problem is:</w:t>
-      </w:r>
-      <w:r>
-        <w:t xml:space="preserve"> </w:t>
-      </w:r>
-      <w:r>
-        <w:rPr>
-          <w:b/>
-        </w:rPr>
-        <w:t xml:space="preserve">how do you turn that ocean of published-but-unstructured data into a clean database at scale, while guaranteeing every number is correct enough to trust?</w:t>
+        <w:t xml:space="preserve">— how much protein, fat, iron or vitamin C a food contains — sits behind every nutrition label, diet app, and dietary guideline. But this data is still built</w:t>
+      </w:r>
+      <w:r>
+        <w:t xml:space="preserve"> </w:t>
+      </w:r>
+      <w:r>
+        <w:rPr>
+          <w:b/>
+        </w:rPr>
+        <w:t xml:space="preserve">by hand</w:t>
+      </w:r>
+      <w:r>
+        <w:t xml:space="preserve">: experts read scientific papers and</w:t>
+      </w:r>
+      <w:r>
+        <w:t xml:space="preserve"> </w:t>
+      </w:r>
+      <w:r>
+        <w:rPr>
+          <w:b/>
+        </w:rPr>
+        <w:t xml:space="preserve">type the numbers into a database one at a time.</w:t>
+      </w:r>
+      <w:r>
+        <w:t xml:space="preserve"> </w:t>
+      </w:r>
+      <w:r>
+        <w:t xml:space="preserve">That is slow and expensive, so the databases stay narrow and quickly go out of date. The data itself already exists — it’s published constantly, just locked inside unstructured PDFs — but reading it out by hand doesn’t scale, and letting an AI read it unchecked produces too many wrong numbers to trust on a food label.</w:t>
       </w:r>
     </w:p>
     <w:p>
@@ -516,443 +403,22 @@
         <w:t xml:space="preserve">OpenNutri</w:t>
       </w:r>
       <w:r>
-        <w:t xml:space="preserve">, a</w:t>
-      </w:r>
-      <w:r>
-        <w:t xml:space="preserve"> </w:t>
-      </w:r>
-      <w:r>
-        <w:rPr>
-          <w:b/>
-        </w:rPr>
-        <w:t xml:space="preserve">“</w:t>
-      </w:r>
-      <w:r>
-        <w:rPr>
-          <w:b/>
-        </w:rPr>
-        <w:t xml:space="preserve">Hybrid Intelligence</w:t>
-      </w:r>
-      <w:r>
-        <w:rPr>
-          <w:b/>
-        </w:rPr>
-        <w:t xml:space="preserve">”</w:t>
-      </w:r>
-      <w:r>
-        <w:rPr>
-          <w:b/>
-        </w:rPr>
-        <w:t xml:space="preserve"> </w:t>
-      </w:r>
-      <w:r>
-        <w:rPr>
-          <w:b/>
-        </w:rPr>
-        <w:t xml:space="preserve">pipeline</w:t>
-      </w:r>
-      <w:r>
-        <w:t xml:space="preserve"> </w:t>
-      </w:r>
-      <w:r>
-        <w:t xml:space="preserve">that flips the model:</w:t>
-      </w:r>
-      <w:r>
-        <w:t xml:space="preserve"> </w:t>
-      </w:r>
-      <w:r>
-        <w:rPr>
-          <w:b/>
-        </w:rPr>
-        <w:t xml:space="preserve">the machine does the discovery and the heavy reading at scale, and the human only verifies.</w:t>
-      </w:r>
-      <w:r>
-        <w:t xml:space="preserve"> </w:t>
-      </w:r>
-      <w:r>
-        <w:t xml:space="preserve">The result is a database that is</w:t>
-      </w:r>
-      <w:r>
-        <w:t xml:space="preserve"> </w:t>
-      </w:r>
-      <w:r>
-        <w:rPr>
-          <w:i/>
-        </w:rPr>
-        <w:t xml:space="preserve">automatically generated, expert-verified, citation-backed, and self-improving</w:t>
-      </w:r>
-      <w:r>
-        <w:t xml:space="preserve"> </w:t>
-      </w:r>
-      <w:r>
-        <w:t xml:space="preserve">— which is exactly where it beats the alternatives: unlike</w:t>
-      </w:r>
-      <w:r>
-        <w:t xml:space="preserve"> </w:t>
-      </w:r>
-      <w:r>
-        <w:rPr>
-          <w:b/>
-        </w:rPr>
-        <w:t xml:space="preserve">USDA / EFSA / TürKomp</w:t>
-      </w:r>
-      <w:r>
-        <w:t xml:space="preserve"> </w:t>
-      </w:r>
-      <w:r>
-        <w:t xml:space="preserve">it reads the literature automatically and attaches</w:t>
-      </w:r>
-      <w:r>
-        <w:t xml:space="preserve"> </w:t>
-      </w:r>
-      <w:r>
-        <w:rPr>
-          <w:b/>
-        </w:rPr>
-        <w:t xml:space="preserve">DOI-level provenance to every value</w:t>
-      </w:r>
-      <w:r>
-        <w:t xml:space="preserve">; unlike</w:t>
-      </w:r>
-      <w:r>
-        <w:t xml:space="preserve"> </w:t>
-      </w:r>
-      <w:r>
-        <w:rPr>
-          <w:b/>
-        </w:rPr>
-        <w:t xml:space="preserve">commercial providers</w:t>
-      </w:r>
-      <w:r>
-        <w:t xml:space="preserve"> </w:t>
-      </w:r>
-      <w:r>
-        <w:t xml:space="preserve">(Edamam, FatSecret) it produces</w:t>
-      </w:r>
-      <w:r>
-        <w:t xml:space="preserve"> </w:t>
-      </w:r>
-      <w:r>
-        <w:rPr>
-          <w:i/>
-        </w:rPr>
-        <w:t xml:space="preserve">new</w:t>
-      </w:r>
-      <w:r>
-        <w:t xml:space="preserve"> </w:t>
-      </w:r>
-      <w:r>
-        <w:t xml:space="preserve">data from primary sources instead of reselling licensed data; and unlike</w:t>
-      </w:r>
-      <w:r>
-        <w:t xml:space="preserve"> </w:t>
-      </w:r>
-      <w:r>
-        <w:rPr>
-          <w:b/>
-        </w:rPr>
-        <w:t xml:space="preserve">a single AI model</w:t>
-      </w:r>
-      <w:r>
-        <w:t xml:space="preserve"> </w:t>
-      </w:r>
-      <w:r>
-        <w:t xml:space="preserve">it uses a</w:t>
-      </w:r>
-      <w:r>
-        <w:t xml:space="preserve"> </w:t>
-      </w:r>
-      <w:r>
-        <w:rPr>
-          <w:b/>
-        </w:rPr>
-        <w:t xml:space="preserve">layered cascade</w:t>
-      </w:r>
-      <w:r>
-        <w:t xml:space="preserve"> </w:t>
-      </w:r>
-      <w:r>
-        <w:t xml:space="preserve">where each paper climbs through progressively more capable, more expensive stages, so only the hard,</w:t>
-      </w:r>
-      <w:r>
-        <w:t xml:space="preserve"> </w:t>
-      </w:r>
-      <w:r>
-        <w:rPr>
-          <w:b/>
-        </w:rPr>
-        <w:t xml:space="preserve">low-confidence</w:t>
-      </w:r>
-      <w:r>
-        <w:t xml:space="preserve"> </w:t>
-      </w:r>
-      <w:r>
-        <w:t xml:space="preserve">cases reach the costly ones — and the papers the AI is least sure about get the most scrutiny (at the top, a human).</w:t>
-      </w:r>
-    </w:p>
-    <w:p>
-      <w:pPr>
-        <w:pStyle w:val="BodyText"/>
-      </w:pPr>
-      <w:r>
-        <w:t xml:space="preserve">The full design has five layers:</w:t>
-      </w:r>
-      <w:r>
-        <w:t xml:space="preserve"> </w:t>
-      </w:r>
-      <w:r>
-        <w:rPr>
-          <w:b/>
-        </w:rPr>
-        <w:t xml:space="preserve">(L1)</w:t>
-      </w:r>
-      <w:r>
-        <w:t xml:space="preserve"> </w:t>
-      </w:r>
-      <w:r>
-        <w:t xml:space="preserve">a crawler,</w:t>
-      </w:r>
-      <w:r>
-        <w:t xml:space="preserve"> </w:t>
-      </w:r>
-      <w:r>
-        <w:rPr>
-          <w:b/>
-        </w:rPr>
-        <w:t xml:space="preserve">(L2)</w:t>
-      </w:r>
-      <w:r>
-        <w:t xml:space="preserve"> </w:t>
-      </w:r>
-      <w:r>
-        <w:t xml:space="preserve">a lightweight filter,</w:t>
-      </w:r>
-      <w:r>
-        <w:t xml:space="preserve"> </w:t>
-      </w:r>
-      <w:r>
-        <w:rPr>
-          <w:b/>
-        </w:rPr>
-        <w:t xml:space="preserve">(L3)</w:t>
-      </w:r>
-      <w:r>
-        <w:t xml:space="preserve"> </w:t>
-      </w:r>
-      <w:r>
-        <w:t xml:space="preserve">open-source extraction models,</w:t>
-      </w:r>
-      <w:r>
-        <w:t xml:space="preserve"> </w:t>
-      </w:r>
-      <w:r>
-        <w:rPr>
-          <w:b/>
-        </w:rPr>
-        <w:t xml:space="preserve">(L4)</w:t>
-      </w:r>
-      <w:r>
-        <w:t xml:space="preserve"> </w:t>
-      </w:r>
-      <w:r>
-        <w:t xml:space="preserve">a stronger commercial model for hard cases, and</w:t>
-      </w:r>
-      <w:r>
-        <w:t xml:space="preserve"> </w:t>
-      </w:r>
-      <w:r>
-        <w:rPr>
-          <w:b/>
-        </w:rPr>
-        <w:t xml:space="preserve">(L5) expert human verification</w:t>
-      </w:r>
-      <w:r>
-        <w:t xml:space="preserve"> </w:t>
-      </w:r>
-      <w:r>
-        <w:t xml:space="preserve">— the final gold-standard record. It is</w:t>
-      </w:r>
-      <w:r>
-        <w:t xml:space="preserve"> </w:t>
-      </w:r>
-      <w:r>
-        <w:rPr>
-          <w:b/>
-        </w:rPr>
-        <w:t xml:space="preserve">self-improving</w:t>
-      </w:r>
-      <w:r>
-        <w:t xml:space="preserve">: every L5 correction flows back as a training signal, so over time the AI handles more on its own and cost per paper falls — something manual curation can never do. Our implementation is one system with three surfaces over a single Supabase Postgres database: a</w:t>
-      </w:r>
-      <w:r>
-        <w:t xml:space="preserve"> </w:t>
-      </w:r>
-      <w:r>
-        <w:rPr>
-          <w:b/>
-        </w:rPr>
-        <w:t xml:space="preserve">Python discovery &amp; extraction pipeline</w:t>
-      </w:r>
-      <w:r>
-        <w:t xml:space="preserve"> </w:t>
-      </w:r>
-      <w:r>
-        <w:t xml:space="preserve">(Arciel — searches the literature, downloads PDFs, runs a working three-stage AI cascade: cheap screening on ~1,500 papers/day → medium triage → a strong PDF model on the best ~20/day = L1–L4), a</w:t>
-      </w:r>
-      <w:r>
-        <w:t xml:space="preserve"> </w:t>
-      </w:r>
-      <w:r>
-        <w:rPr>
-          <w:b/>
-        </w:rPr>
-        <w:t xml:space="preserve">Supabase database contract</w:t>
-      </w:r>
-      <w:r>
-        <w:t xml:space="preserve"> </w:t>
-      </w:r>
-      <w:r>
-        <w:t xml:space="preserve">(Arciel — immutable storage, row-level security, the review workflow), and</w:t>
-      </w:r>
-      <w:r>
-        <w:t xml:space="preserve"> </w:t>
-      </w:r>
-      <w:r>
-        <w:rPr>
-          <w:b/>
-        </w:rPr>
-        <w:t xml:space="preserve">the expert-annotator web app</w:t>
-      </w:r>
-      <w:r>
-        <w:t xml:space="preserve"> </w:t>
-      </w:r>
-      <w:r>
-        <w:t xml:space="preserve">(my frontend) —</w:t>
-      </w:r>
-      <w:r>
-        <w:t xml:space="preserve"> </w:t>
-      </w:r>
-      <w:r>
-        <w:rPr>
-          <w:b/>
-        </w:rPr>
-        <w:t xml:space="preserve">Layer 5, the human-verification layer, which the rest of this document is about.</w:t>
-      </w:r>
-    </w:p>
-    <w:p>
-      <w:pPr>
-        <w:pStyle w:val="Heading2"/>
-      </w:pPr>
-      <w:bookmarkStart w:id="24" w:name="X33621e355673d8b14159b0967cf00b8abe22ab0"/>
-      <w:r>
-        <w:t xml:space="preserve">3. What is my part, why is it necessary, and what did I do?</w:t>
-      </w:r>
-      <w:bookmarkEnd w:id="24"/>
-    </w:p>
-    <w:p>
-      <w:pPr>
-        <w:pStyle w:val="FirstParagraph"/>
-      </w:pPr>
-      <w:r>
-        <w:rPr>
-          <w:b/>
-        </w:rPr>
-        <w:t xml:space="preserve">My part is the entire expert-annotator frontend</w:t>
-      </w:r>
-      <w:r>
-        <w:t xml:space="preserve"> </w:t>
-      </w:r>
-      <w:r>
-        <w:t xml:space="preserve">— the</w:t>
-      </w:r>
-      <w:r>
-        <w:t xml:space="preserve"> </w:t>
-      </w:r>
-      <w:r>
-        <w:rPr>
-          <w:b/>
-        </w:rPr>
-        <w:t xml:space="preserve">React 19 + Vite</w:t>
-      </w:r>
-      <w:r>
-        <w:t xml:space="preserve"> </w:t>
-      </w:r>
-      <w:r>
-        <w:t xml:space="preserve">app, deployed on</w:t>
-      </w:r>
-      <w:r>
-        <w:t xml:space="preserve"> </w:t>
-      </w:r>
-      <w:r>
-        <w:rPr>
-          <w:b/>
-        </w:rPr>
-        <w:t xml:space="preserve">Vercel</w:t>
-      </w:r>
-      <w:r>
-        <w:t xml:space="preserve">, that every verifier and approver uses. In OpenNutri’s design it is</w:t>
-      </w:r>
-      <w:r>
-        <w:t xml:space="preserve"> </w:t>
-      </w:r>
-      <w:r>
-        <w:rPr>
-          <w:b/>
-        </w:rPr>
-        <w:t xml:space="preserve">Layer 5 — Expert Human Verification, the</w:t>
-      </w:r>
-      <w:r>
-        <w:rPr>
-          <w:b/>
-        </w:rPr>
-        <w:t xml:space="preserve"> </w:t>
-      </w:r>
-      <w:r>
-        <w:rPr>
-          <w:b/>
-        </w:rPr>
-        <w:t xml:space="preserve">“</w:t>
-      </w:r>
-      <w:r>
-        <w:rPr>
-          <w:b/>
-        </w:rPr>
-        <w:t xml:space="preserve">Gold Standard</w:t>
-      </w:r>
-      <w:r>
-        <w:rPr>
-          <w:b/>
-        </w:rPr>
-        <w:t xml:space="preserve">”</w:t>
-      </w:r>
-      <w:r>
-        <w:rPr>
-          <w:b/>
-        </w:rPr>
-        <w:t xml:space="preserve"> </w:t>
-      </w:r>
-      <w:r>
-        <w:rPr>
-          <w:b/>
-        </w:rPr>
-        <w:t xml:space="preserve">layer.</w:t>
-      </w:r>
-    </w:p>
-    <w:p>
-      <w:pPr>
-        <w:pStyle w:val="BodyText"/>
-      </w:pPr>
-      <w:r>
-        <w:rPr>
-          <w:b/>
-        </w:rPr>
-        <w:t xml:space="preserve">Why it is necessary: it replaces manual data entry with verification.</w:t>
-      </w:r>
-      <w:r>
-        <w:t xml:space="preserve"> </w:t>
-      </w:r>
-      <w:r>
-        <w:t xml:space="preserve">Every existing database is built by an expert doing manual entry — read the paper, find the table, decode units, type each number. My frontend breaks that bottleneck three ways:</w:t>
+        <w:t xml:space="preserve">: instead of a person reading each paper from scratch,</w:t>
+      </w:r>
+      <w:r>
+        <w:t xml:space="preserve"> </w:t>
+      </w:r>
+      <w:r>
+        <w:rPr>
+          <w:b/>
+        </w:rPr>
+        <w:t xml:space="preserve">the AI does the reading and proposes the numbers, and a person only verifies them.</w:t>
+      </w:r>
+      <w:r>
+        <w:t xml:space="preserve"> </w:t>
+      </w:r>
+      <w:r>
+        <w:t xml:space="preserve">It splits into three parts:</w:t>
       </w:r>
     </w:p>
     <w:p>
@@ -967,103 +433,28 @@
         <w:rPr>
           <w:b/>
         </w:rPr>
-        <w:t xml:space="preserve">It turns</w:t>
-      </w:r>
-      <w:r>
-        <w:rPr>
-          <w:b/>
-        </w:rPr>
-        <w:t xml:space="preserve"> </w:t>
-      </w:r>
-      <w:r>
-        <w:rPr>
-          <w:b/>
-        </w:rPr>
-        <w:t xml:space="preserve">“</w:t>
-      </w:r>
-      <w:r>
-        <w:rPr>
-          <w:b/>
-        </w:rPr>
-        <w:t xml:space="preserve">transcribe from scratch</w:t>
-      </w:r>
-      <w:r>
-        <w:rPr>
-          <w:b/>
-        </w:rPr>
-        <w:t xml:space="preserve">”</w:t>
-      </w:r>
-      <w:r>
-        <w:rPr>
-          <w:b/>
-        </w:rPr>
-        <w:t xml:space="preserve"> </w:t>
-      </w:r>
-      <w:r>
-        <w:rPr>
-          <w:b/>
-        </w:rPr>
-        <w:t xml:space="preserve">into</w:t>
-      </w:r>
-      <w:r>
-        <w:rPr>
-          <w:b/>
-        </w:rPr>
-        <w:t xml:space="preserve"> </w:t>
-      </w:r>
-      <w:r>
-        <w:rPr>
-          <w:b/>
-        </w:rPr>
-        <w:t xml:space="preserve">“</w:t>
-      </w:r>
-      <w:r>
-        <w:rPr>
-          <w:b/>
-        </w:rPr>
-        <w:t xml:space="preserve">review a draft.</w:t>
-      </w:r>
-      <w:r>
-        <w:rPr>
-          <w:b/>
-        </w:rPr>
-        <w:t xml:space="preserve">”</w:t>
-      </w:r>
-      <w:r>
-        <w:t xml:space="preserve"> </w:t>
-      </w:r>
-      <w:r>
-        <w:t xml:space="preserve">Only the papers where the AI’s confidence is</w:t>
-      </w:r>
-      <w:r>
-        <w:t xml:space="preserve"> </w:t>
-      </w:r>
-      <w:r>
-        <w:rPr>
-          <w:b/>
-        </w:rPr>
-        <w:t xml:space="preserve">low</w:t>
-      </w:r>
-      <w:r>
-        <w:t xml:space="preserve"> </w:t>
-      </w:r>
-      <w:r>
-        <w:t xml:space="preserve">are routed to a human — the cascade spends scarce expert time exactly where the AI is unsure, not on everything. By the time a paper reaches the screen, the AI has already found it, read it, and pre-filled candidate values, so the expert</w:t>
-      </w:r>
-      <w:r>
-        <w:t xml:space="preserve"> </w:t>
-      </w:r>
-      <w:r>
-        <w:rPr>
-          <w:b/>
-        </w:rPr>
-        <w:t xml:space="preserve">verifies and corrects</w:t>
-      </w:r>
-      <w:r>
-        <w:t xml:space="preserve"> </w:t>
-      </w:r>
-      <w:r>
-        <w:t xml:space="preserve">instead of transcribing — the difference between a few papers an hour and the ~8–12 verified papers/day this project needs.</w:t>
+        <w:t xml:space="preserve">A backend pipeline</w:t>
+      </w:r>
+      <w:r>
+        <w:t xml:space="preserve"> </w:t>
+      </w:r>
+      <w:r>
+        <w:t xml:space="preserve">(Arciel) that finds relevant papers, downloads the PDFs, and runs AI models over them to produce</w:t>
+      </w:r>
+      <w:r>
+        <w:t xml:space="preserve"> </w:t>
+      </w:r>
+      <w:r>
+        <w:rPr>
+          <w:i/>
+        </w:rPr>
+        <w:t xml:space="preserve">candidate</w:t>
+      </w:r>
+      <w:r>
+        <w:t xml:space="preserve"> </w:t>
+      </w:r>
+      <w:r>
+        <w:t xml:space="preserve">nutrient values.</w:t>
       </w:r>
     </w:p>
     <w:p>
@@ -1078,58 +469,13 @@
         <w:rPr>
           <w:b/>
         </w:rPr>
-        <w:t xml:space="preserve">It makes the evidence instant instead of a manual search.</w:t>
-      </w:r>
-      <w:r>
-        <w:t xml:space="preserve"> </w:t>
-      </w:r>
-      <w:r>
-        <w:t xml:space="preserve">The slowest, most error-prone step in manual entry is</w:t>
-      </w:r>
-      <w:r>
-        <w:t xml:space="preserve"> </w:t>
-      </w:r>
-      <w:r>
-        <w:rPr>
-          <w:i/>
-        </w:rPr>
-        <w:t xml:space="preserve">finding</w:t>
-      </w:r>
-      <w:r>
-        <w:t xml:space="preserve"> </w:t>
-      </w:r>
-      <w:r>
-        <w:t xml:space="preserve">the right value in a 15-page PDF and being sure of the row, column, and units. My UI lights up</w:t>
-      </w:r>
-      <w:r>
-        <w:t xml:space="preserve"> </w:t>
-      </w:r>
-      <w:r>
-        <w:rPr>
-          <w:b/>
-        </w:rPr>
-        <w:t xml:space="preserve">the exact table or sentence a value came from</w:t>
-      </w:r>
-      <w:r>
-        <w:t xml:space="preserve"> </w:t>
-      </w:r>
-      <w:r>
-        <w:t xml:space="preserve">and makes the nutrient names in it clickable, so the expert’s eyes go straight to the evidence and confirm rather than search. This is</w:t>
-      </w:r>
-      <w:r>
-        <w:t xml:space="preserve"> </w:t>
-      </w:r>
-      <w:r>
-        <w:rPr>
-          <w:i/>
-        </w:rPr>
-        <w:t xml:space="preserve">why</w:t>
-      </w:r>
-      <w:r>
-        <w:t xml:space="preserve"> </w:t>
-      </w:r>
-      <w:r>
-        <w:t xml:space="preserve">my hardest work, the PDF evidence engine, had to exist.</w:t>
+        <w:t xml:space="preserve">A database</w:t>
+      </w:r>
+      <w:r>
+        <w:t xml:space="preserve"> </w:t>
+      </w:r>
+      <w:r>
+        <w:t xml:space="preserve">(Arciel) that stores everything and runs the review workflow.</w:t>
       </w:r>
     </w:p>
     <w:p>
@@ -1144,96 +490,49 @@
         <w:rPr>
           <w:b/>
         </w:rPr>
-        <w:t xml:space="preserve">It is the only place expert-verified, gold-standard truth — and the training signal — is produced.</w:t>
-      </w:r>
-      <w:r>
-        <w:t xml:space="preserve"> </w:t>
-      </w:r>
-      <w:r>
-        <w:t xml:space="preserve">Manual entry yields a number and nothing else; my UI yields a number</w:t>
-      </w:r>
-      <w:r>
-        <w:t xml:space="preserve"> </w:t>
-      </w:r>
-      <w:r>
-        <w:rPr>
-          <w:b/>
-        </w:rPr>
-        <w:t xml:space="preserve">plus</w:t>
-      </w:r>
-      <w:r>
-        <w:t xml:space="preserve"> </w:t>
-      </w:r>
-      <w:r>
-        <w:t xml:space="preserve">an error-categorized correction that retrains the AI,</w:t>
-      </w:r>
-      <w:r>
-        <w:t xml:space="preserve"> </w:t>
-      </w:r>
-      <w:r>
-        <w:rPr>
-          <w:b/>
-        </w:rPr>
-        <w:t xml:space="preserve">plus</w:t>
-      </w:r>
-      <w:r>
-        <w:t xml:space="preserve"> </w:t>
-      </w:r>
-      <w:r>
-        <w:t xml:space="preserve">automatic DOI provenance,</w:t>
-      </w:r>
-      <w:r>
-        <w:t xml:space="preserve"> </w:t>
-      </w:r>
-      <w:r>
-        <w:rPr>
-          <w:b/>
-        </w:rPr>
-        <w:t xml:space="preserve">plus</w:t>
-      </w:r>
-      <w:r>
-        <w:t xml:space="preserve"> </w:t>
-      </w:r>
-      <w:r>
-        <w:t xml:space="preserve">the immutable audit record behind the project’s &lt;0.5% error bar.</w:t>
-      </w:r>
+        <w:t xml:space="preserve">The annotator web app</w:t>
+      </w:r>
+      <w:r>
+        <w:t xml:space="preserve"> </w:t>
+      </w:r>
+      <w:r>
+        <w:t xml:space="preserve">(my frontend) — where a human checks and corrects those candidate values.</w:t>
+      </w:r>
+      <w:r>
+        <w:t xml:space="preserve"> </w:t>
+      </w:r>
+      <w:r>
+        <w:rPr>
+          <w:b/>
+        </w:rPr>
+        <w:t xml:space="preserve">This is the part I built, and the rest of this document is about it.</w:t>
+      </w:r>
+    </w:p>
+    <w:p>
+      <w:pPr>
+        <w:pStyle w:val="Heading2"/>
+      </w:pPr>
+      <w:bookmarkStart w:id="24" w:name="X33621e355673d8b14159b0967cf00b8abe22ab0"/>
+      <w:r>
+        <w:t xml:space="preserve">3. What is my part, why is it necessary, and what did I do?</w:t>
+      </w:r>
+      <w:bookmarkEnd w:id="24"/>
     </w:p>
     <w:p>
       <w:pPr>
         <w:pStyle w:val="FirstParagraph"/>
       </w:pPr>
       <w:r>
-        <w:t xml:space="preserve">In short,</w:t>
-      </w:r>
-      <w:r>
-        <w:t xml:space="preserve"> </w:t>
-      </w:r>
-      <w:r>
-        <w:rPr>
-          <w:b/>
-        </w:rPr>
-        <w:t xml:space="preserve">manual data entry doesn’t scale and never improves; the verification UI I built does both</w:t>
-      </w:r>
-      <w:r>
-        <w:t xml:space="preserve"> </w:t>
-      </w:r>
-      <w:r>
-        <w:t xml:space="preserve">— and it had to do it inside the project’s</w:t>
-      </w:r>
-      <w:r>
-        <w:t xml:space="preserve"> </w:t>
-      </w:r>
-      <w:r>
-        <w:rPr>
-          <w:b/>
-        </w:rPr>
-        <w:t xml:space="preserve">free-tier</w:t>
-      </w:r>
-      <w:r>
-        <w:t xml:space="preserve"> </w:t>
-      </w:r>
-      <w:r>
-        <w:t xml:space="preserve">data limits (Supabase, Vercel) while still feeling instant.</w:t>
+        <w:rPr>
+          <w:b/>
+        </w:rPr>
+        <w:t xml:space="preserve">My part is the entire annotator frontend</w:t>
+      </w:r>
+      <w:r>
+        <w:t xml:space="preserve"> </w:t>
+      </w:r>
+      <w:r>
+        <w:t xml:space="preserve">— the React app (deployed on Vercel) that every verifier uses to turn the AI’s raw guesses into trustworthy data.</w:t>
       </w:r>
     </w:p>
     <w:p>
@@ -1244,25 +543,69 @@
         <w:rPr>
           <w:b/>
         </w:rPr>
+        <w:t xml:space="preserve">Why it’s necessary.</w:t>
+      </w:r>
+      <w:r>
+        <w:t xml:space="preserve"> </w:t>
+      </w:r>
+      <w:r>
+        <w:t xml:space="preserve">Without it, an expert would have to do the old manual job: read the whole paper, find the right table, and type every number. My app changes the unit of work from</w:t>
+      </w:r>
+      <w:r>
+        <w:t xml:space="preserve"> </w:t>
+      </w:r>
+      <w:r>
+        <w:rPr>
+          <w:i/>
+        </w:rPr>
+        <w:t xml:space="preserve">transcribing</w:t>
+      </w:r>
+      <w:r>
+        <w:t xml:space="preserve"> </w:t>
+      </w:r>
+      <w:r>
+        <w:t xml:space="preserve">to</w:t>
+      </w:r>
+      <w:r>
+        <w:t xml:space="preserve"> </w:t>
+      </w:r>
+      <w:r>
+        <w:rPr>
+          <w:i/>
+        </w:rPr>
+        <w:t xml:space="preserve">verifying</w:t>
+      </w:r>
+      <w:r>
+        <w:t xml:space="preserve">. The paper arrives already pre-filled with the AI’s values, and — this is the core idea —</w:t>
+      </w:r>
+      <w:r>
+        <w:t xml:space="preserve"> </w:t>
+      </w:r>
+      <w:r>
+        <w:rPr>
+          <w:b/>
+        </w:rPr>
+        <w:t xml:space="preserve">the exact table or sentence each value came from lights up on the PDF</w:t>
+      </w:r>
+      <w:r>
+        <w:t xml:space="preserve">, with the nutrient names in it clickable, so the expert’s eye goes straight to the evidence and confirms instead of hunting. That is what makes a verifier fast enough to be worth it (and the cases the AI is least sure about are exactly the ones a human looks at). Every correction is also fed back to improve the AI over time.</w:t>
+      </w:r>
+    </w:p>
+    <w:p>
+      <w:pPr>
+        <w:pStyle w:val="BodyText"/>
+      </w:pPr>
+      <w:r>
+        <w:rPr>
+          <w:b/>
+        </w:rPr>
         <w:t xml:space="preserve">What I did, in one sentence:</w:t>
       </w:r>
       <w:r>
         <w:t xml:space="preserve"> </w:t>
       </w:r>
       <w:r>
-        <w:t xml:space="preserve">I built the workspace where a labeler opens a paper,</w:t>
-      </w:r>
-      <w:r>
-        <w:t xml:space="preserve"> </w:t>
-      </w:r>
-      <w:r>
-        <w:rPr>
-          <w:b/>
-        </w:rPr>
-        <w:t xml:space="preserve">the exact table or paragraph a value came from lights up on the PDF</w:t>
-      </w:r>
-      <w:r>
-        <w:t xml:space="preserve">, the nutrient names become clickable, a click drops the value into an editor, forgiving search maps it to the canonical food/nutrient catalog, and the validated submission is stored — all client-side, on arbitrary publisher PDFs, fast enough to do all day. Concretely, I own seven things, which the next section walks through one by one:</w:t>
+        <w:t xml:space="preserve">I built the workspace where a labeler opens a paper, the source of each value lights up on the PDF, a click drops a value into the editor, forgiving search maps free text to the food/nutrient catalog, and the finished submission is stored — all in the browser, on arbitrary publisher PDFs, fast enough to do all day. Concretely, I own seven things, which the next section walks through one by one:</w:t>
       </w:r>
     </w:p>
     <w:p>
@@ -4908,16 +4251,16 @@
         <w:t xml:space="preserve"> </w:t>
       </w:r>
       <w:r>
-        <w:t xml:space="preserve">—</w:t>
-      </w:r>
-      <w:r>
-        <w:t xml:space="preserve"> </w:t>
-      </w:r>
-      <w:r>
-        <w:rPr>
-          <w:b/>
-        </w:rPr>
-        <w:t xml:space="preserve">Layer 5, the expert-verification layer</w:t>
+        <w:t xml:space="preserve">— the</w:t>
+      </w:r>
+      <w:r>
+        <w:t xml:space="preserve"> </w:t>
+      </w:r>
+      <w:r>
+        <w:rPr>
+          <w:b/>
+        </w:rPr>
+        <w:t xml:space="preserve">expert-verification layer</w:t>
       </w:r>
       <w:r>
         <w:t xml:space="preserve"> </w:t>
@@ -5259,147 +4602,37 @@
         <w:t xml:space="preserve"> </w:t>
       </w:r>
       <w:r>
-        <w:t xml:space="preserve">— bir gıdanın gerçekte ne kadar protein, yağ, demir ya da C vitamini içerdiği — besin etiketlerinin, diyet uygulamalarının, ihracat uyumunun, klinik beslenmenin ve halk sağlığı politikasının temelidir. Asıl sorun,</w:t>
-      </w:r>
-      <w:r>
-        <w:t xml:space="preserve"> </w:t>
-      </w:r>
-      <w:r>
-        <w:rPr>
-          <w:b/>
-        </w:rPr>
-        <w:t xml:space="preserve">bu verinin bugün nasıl kurulduğudur.</w:t>
-      </w:r>
-      <w:r>
-        <w:t xml:space="preserve"> </w:t>
-      </w:r>
-      <w:r>
-        <w:t xml:space="preserve">Dünyanın dayandığı her referans veritabanı — USDA FoodData Central, AB’nin EFSA’sı, Türkiye’nin TürKomp’u — aynı şekilde yapılır:</w:t>
-      </w:r>
-      <w:r>
-        <w:t xml:space="preserve"> </w:t>
-      </w:r>
-      <w:r>
-        <w:rPr>
-          <w:b/>
-        </w:rPr>
-        <w:t xml:space="preserve">insan uzmanlar değerleri bilimsel makalelerden elle, tek tek sayı sayı kopyalar.</w:t>
-      </w:r>
-      <w:r>
-        <w:t xml:space="preserve"> </w:t>
-      </w:r>
-      <w:r>
-        <w:t xml:space="preserve">Bu manuel darboğaz onları</w:t>
-      </w:r>
-      <w:r>
-        <w:t xml:space="preserve"> </w:t>
-      </w:r>
-      <w:r>
-        <w:rPr>
-          <w:b/>
-        </w:rPr>
-        <w:t xml:space="preserve">dar</w:t>
-      </w:r>
-      <w:r>
-        <w:t xml:space="preserve"> </w:t>
-      </w:r>
-      <w:r>
-        <w:t xml:space="preserve">(yalnızca yaygın gıdalar — literatürde görünen binlerce gıda ne USDA’da ne EFSA’dadır),</w:t>
-      </w:r>
-      <w:r>
-        <w:t xml:space="preserve"> </w:t>
-      </w:r>
-      <w:r>
-        <w:rPr>
-          <w:b/>
-        </w:rPr>
-        <w:t xml:space="preserve">eski</w:t>
-      </w:r>
-      <w:r>
-        <w:t xml:space="preserve"> </w:t>
-      </w:r>
-      <w:r>
-        <w:t xml:space="preserve">(TürKomp 2014’ten beri neredeyse hiç ilerlemedi) ve</w:t>
-      </w:r>
-      <w:r>
-        <w:t xml:space="preserve"> </w:t>
-      </w:r>
-      <w:r>
-        <w:rPr>
-          <w:b/>
-        </w:rPr>
-        <w:t xml:space="preserve">ücretli</w:t>
-      </w:r>
-      <w:r>
-        <w:t xml:space="preserve"> </w:t>
-      </w:r>
-      <w:r>
-        <w:t xml:space="preserve">(kurması o kadar pahalı ki sonuç ücretle lisanslanır) kılar.</w:t>
-      </w:r>
-    </w:p>
-    <w:p>
-      <w:pPr>
-        <w:pStyle w:val="BodyText"/>
-      </w:pPr>
-      <w:r>
-        <w:t xml:space="preserve">Oysa</w:t>
-      </w:r>
-      <w:r>
-        <w:t xml:space="preserve"> </w:t>
-      </w:r>
-      <w:r>
-        <w:rPr>
-          <w:b/>
-        </w:rPr>
-        <w:t xml:space="preserve">veri zaten mevcuttur</w:t>
-      </w:r>
-      <w:r>
-        <w:t xml:space="preserve"> </w:t>
-      </w:r>
-      <w:r>
-        <w:t xml:space="preserve">— her gün binlerce makalede yayımlanır, yalnızca dipnotlar, birimler ve çok sütunlu tablolarla dolu yapısız PDF’lerin içinde kilitlidir. Bir veritabanında olmamasının nedeni</w:t>
-      </w:r>
-      <w:r>
-        <w:t xml:space="preserve"> </w:t>
-      </w:r>
-      <w:r>
-        <w:rPr>
-          <w:b/>
-        </w:rPr>
-        <w:t xml:space="preserve">onu elle okuyup çıkarmanın ölçeklenmemesidir</w:t>
-      </w:r>
-      <w:r>
-        <w:t xml:space="preserve"> </w:t>
-      </w:r>
-      <w:r>
-        <w:t xml:space="preserve">— ama bariz kısayol olan</w:t>
-      </w:r>
-      <w:r>
-        <w:t xml:space="preserve"> </w:t>
-      </w:r>
-      <w:r>
-        <w:t xml:space="preserve">“</w:t>
-      </w:r>
-      <w:r>
-        <w:t xml:space="preserve">bırak yapay zekâ makaleleri okusun</w:t>
-      </w:r>
-      <w:r>
-        <w:t xml:space="preserve">”</w:t>
-      </w:r>
-      <w:r>
-        <w:t xml:space="preserve"> </w:t>
-      </w:r>
-      <w:r>
-        <w:t xml:space="preserve">çok fazla yanlış sayı üretir ve bir besin etiketindeki yanlış bir değer, hiç değer olmamasından daha kötüdür. Yani asıl problem:</w:t>
-      </w:r>
-      <w:r>
-        <w:t xml:space="preserve"> </w:t>
-      </w:r>
-      <w:r>
-        <w:rPr>
-          <w:b/>
-        </w:rPr>
-        <w:t xml:space="preserve">o yayımlanmış-ama-yapısız veri okyanusunu, her sayının güvenilecek kadar doğru olduğunu garanti ederken, ölçekli biçimde nasıl temiz bir veritabanına dönüştürürsün?</w:t>
+        <w:t xml:space="preserve">— bir gıdanın ne kadar protein, yağ, demir ya da C vitamini içerdiği — her besin etiketinin, diyet uygulamasının ve beslenme kılavuzunun arkasındadır. Ama bu veri hâlâ</w:t>
+      </w:r>
+      <w:r>
+        <w:t xml:space="preserve"> </w:t>
+      </w:r>
+      <w:r>
+        <w:rPr>
+          <w:b/>
+        </w:rPr>
+        <w:t xml:space="preserve">elle</w:t>
+      </w:r>
+      <w:r>
+        <w:t xml:space="preserve"> </w:t>
+      </w:r>
+      <w:r>
+        <w:t xml:space="preserve">kurulur: uzmanlar bilimsel makaleleri okur ve</w:t>
+      </w:r>
+      <w:r>
+        <w:t xml:space="preserve"> </w:t>
+      </w:r>
+      <w:r>
+        <w:rPr>
+          <w:b/>
+        </w:rPr>
+        <w:t xml:space="preserve">sayıları tek tek veritabanına yazar.</w:t>
+      </w:r>
+      <w:r>
+        <w:t xml:space="preserve"> </w:t>
+      </w:r>
+      <w:r>
+        <w:t xml:space="preserve">Bu yavaş ve pahalı olduğundan veritabanları dar kalır ve hızla eskir. Verinin kendisi zaten mevcuttur — sürekli yayımlanır, yalnızca yapısız PDF’lerin içinde kilitlidir — ama onu elle çıkarmak ölçeklenmez, denetimsiz bir yapay zekâya okutmak ise bir besin etiketinde güvenilemeyecek kadar çok yanlış sayı üretir.</w:t>
       </w:r>
     </w:p>
     <w:p>
@@ -5417,458 +4650,28 @@
         <w:pStyle w:val="FirstParagraph"/>
       </w:pPr>
       <w:r>
-        <w:t xml:space="preserve">Modeli tersine çeviren bir</w:t>
-      </w:r>
-      <w:r>
-        <w:t xml:space="preserve"> </w:t>
-      </w:r>
-      <w:r>
-        <w:rPr>
-          <w:b/>
-        </w:rPr>
-        <w:t xml:space="preserve">“</w:t>
-      </w:r>
-      <w:r>
-        <w:rPr>
-          <w:b/>
-        </w:rPr>
-        <w:t xml:space="preserve">Hibrit Zekâ</w:t>
-      </w:r>
-      <w:r>
-        <w:rPr>
-          <w:b/>
-        </w:rPr>
-        <w:t xml:space="preserve">”</w:t>
-      </w:r>
-      <w:r>
-        <w:rPr>
-          <w:b/>
-        </w:rPr>
-        <w:t xml:space="preserve"> </w:t>
-      </w:r>
-      <w:r>
-        <w:rPr>
-          <w:b/>
-        </w:rPr>
-        <w:t xml:space="preserve">hattı</w:t>
-      </w:r>
-      <w:r>
-        <w:t xml:space="preserve"> </w:t>
-      </w:r>
-      <w:r>
-        <w:t xml:space="preserve">olan</w:t>
-      </w:r>
-      <w:r>
-        <w:t xml:space="preserve"> </w:t>
-      </w:r>
-      <w:r>
         <w:rPr>
           <w:b/>
         </w:rPr>
         <w:t xml:space="preserve">OpenNutri</w:t>
       </w:r>
       <w:r>
-        <w:t xml:space="preserve">’yi kurduk:</w:t>
-      </w:r>
-      <w:r>
-        <w:t xml:space="preserve"> </w:t>
-      </w:r>
-      <w:r>
-        <w:rPr>
-          <w:b/>
-        </w:rPr>
-        <w:t xml:space="preserve">makine keşfi ve ağır okumayı ölçekte yapar, insan ise yalnızca doğrular.</w:t>
-      </w:r>
-      <w:r>
-        <w:t xml:space="preserve"> </w:t>
-      </w:r>
-      <w:r>
-        <w:t xml:space="preserve">Sonuç;</w:t>
-      </w:r>
-      <w:r>
-        <w:t xml:space="preserve"> </w:t>
-      </w:r>
-      <w:r>
-        <w:rPr>
-          <w:i/>
-        </w:rPr>
-        <w:t xml:space="preserve">otomatik üretilen, uzman-doğrulamalı, atıf-destekli ve kendini geliştiren</w:t>
-      </w:r>
-      <w:r>
-        <w:t xml:space="preserve"> </w:t>
-      </w:r>
-      <w:r>
-        <w:t xml:space="preserve">bir veritabanıdır — ki tam da burada alternatifleri geçer:</w:t>
-      </w:r>
-      <w:r>
-        <w:t xml:space="preserve"> </w:t>
-      </w:r>
-      <w:r>
-        <w:rPr>
-          <w:b/>
-        </w:rPr>
-        <w:t xml:space="preserve">USDA / EFSA / TürKomp’un</w:t>
-      </w:r>
-      <w:r>
-        <w:t xml:space="preserve"> </w:t>
-      </w:r>
-      <w:r>
-        <w:t xml:space="preserve">aksine literatürü otomatik okur ve</w:t>
-      </w:r>
-      <w:r>
-        <w:t xml:space="preserve"> </w:t>
-      </w:r>
-      <w:r>
-        <w:rPr>
-          <w:b/>
-        </w:rPr>
-        <w:t xml:space="preserve">her bir değere DOI düzeyinde köken bilgisi</w:t>
-      </w:r>
-      <w:r>
-        <w:t xml:space="preserve"> </w:t>
-      </w:r>
-      <w:r>
-        <w:t xml:space="preserve">iliştirir;</w:t>
-      </w:r>
-      <w:r>
-        <w:t xml:space="preserve"> </w:t>
-      </w:r>
-      <w:r>
-        <w:rPr>
-          <w:b/>
-        </w:rPr>
-        <w:t xml:space="preserve">ticari sağlayıcıların</w:t>
-      </w:r>
-      <w:r>
-        <w:t xml:space="preserve"> </w:t>
-      </w:r>
-      <w:r>
-        <w:t xml:space="preserve">(Edamam, FatSecret) aksine lisanslı veriyi yeniden satmak yerine birincil kaynaklardan</w:t>
-      </w:r>
-      <w:r>
-        <w:t xml:space="preserve"> </w:t>
-      </w:r>
-      <w:r>
-        <w:rPr>
-          <w:i/>
-        </w:rPr>
-        <w:t xml:space="preserve">yeni</w:t>
-      </w:r>
-      <w:r>
-        <w:t xml:space="preserve"> </w:t>
-      </w:r>
-      <w:r>
-        <w:t xml:space="preserve">veri üretir; ve</w:t>
-      </w:r>
-      <w:r>
-        <w:t xml:space="preserve"> </w:t>
-      </w:r>
-      <w:r>
-        <w:rPr>
-          <w:b/>
-        </w:rPr>
-        <w:t xml:space="preserve">tek bir yapay zekâ modelinin</w:t>
-      </w:r>
-      <w:r>
-        <w:t xml:space="preserve"> </w:t>
-      </w:r>
-      <w:r>
-        <w:t xml:space="preserve">aksine, her makalenin giderek daha yetenekli, daha pahalı aşamalardan geçtiği</w:t>
-      </w:r>
-      <w:r>
-        <w:t xml:space="preserve"> </w:t>
-      </w:r>
-      <w:r>
-        <w:rPr>
-          <w:b/>
-        </w:rPr>
-        <w:t xml:space="preserve">katmanlı bir kademe</w:t>
-      </w:r>
-      <w:r>
-        <w:t xml:space="preserve"> </w:t>
-      </w:r>
-      <w:r>
-        <w:t xml:space="preserve">kullanır — böylece yalnızca zor,</w:t>
-      </w:r>
-      <w:r>
-        <w:t xml:space="preserve"> </w:t>
-      </w:r>
-      <w:r>
-        <w:rPr>
-          <w:b/>
-        </w:rPr>
-        <w:t xml:space="preserve">düşük-güvenli</w:t>
-      </w:r>
-      <w:r>
-        <w:t xml:space="preserve"> </w:t>
-      </w:r>
-      <w:r>
-        <w:t xml:space="preserve">vakalar pahalı katmanlara ulaşır ve yapay zekânın en az emin olduğu makaleler en çok incelemeyi alır (en tepede bir insan).</w:t>
-      </w:r>
-    </w:p>
-    <w:p>
-      <w:pPr>
-        <w:pStyle w:val="BodyText"/>
-      </w:pPr>
-      <w:r>
-        <w:t xml:space="preserve">Tam tasarımı beş katmanlıdır:</w:t>
-      </w:r>
-      <w:r>
-        <w:t xml:space="preserve"> </w:t>
-      </w:r>
-      <w:r>
-        <w:rPr>
-          <w:b/>
-        </w:rPr>
-        <w:t xml:space="preserve">(L1)</w:t>
-      </w:r>
-      <w:r>
-        <w:t xml:space="preserve"> </w:t>
-      </w:r>
-      <w:r>
-        <w:t xml:space="preserve">bir tarayıcı,</w:t>
-      </w:r>
-      <w:r>
-        <w:t xml:space="preserve"> </w:t>
-      </w:r>
-      <w:r>
-        <w:rPr>
-          <w:b/>
-        </w:rPr>
-        <w:t xml:space="preserve">(L2)</w:t>
-      </w:r>
-      <w:r>
-        <w:t xml:space="preserve"> </w:t>
-      </w:r>
-      <w:r>
-        <w:t xml:space="preserve">hafif bir filtre,</w:t>
-      </w:r>
-      <w:r>
-        <w:t xml:space="preserve"> </w:t>
-      </w:r>
-      <w:r>
-        <w:rPr>
-          <w:b/>
-        </w:rPr>
-        <w:t xml:space="preserve">(L3)</w:t>
-      </w:r>
-      <w:r>
-        <w:t xml:space="preserve"> </w:t>
-      </w:r>
-      <w:r>
-        <w:t xml:space="preserve">açık kaynak çıkarım modelleri,</w:t>
-      </w:r>
-      <w:r>
-        <w:t xml:space="preserve"> </w:t>
-      </w:r>
-      <w:r>
-        <w:rPr>
-          <w:b/>
-        </w:rPr>
-        <w:t xml:space="preserve">(L4)</w:t>
-      </w:r>
-      <w:r>
-        <w:t xml:space="preserve"> </w:t>
-      </w:r>
-      <w:r>
-        <w:t xml:space="preserve">zor vakalar için daha güçlü bir ticari model ve</w:t>
-      </w:r>
-      <w:r>
-        <w:t xml:space="preserve"> </w:t>
-      </w:r>
-      <w:r>
-        <w:rPr>
-          <w:b/>
-        </w:rPr>
-        <w:t xml:space="preserve">(L5) uzman insan doğrulaması</w:t>
-      </w:r>
-      <w:r>
-        <w:t xml:space="preserve"> </w:t>
-      </w:r>
-      <w:r>
-        <w:t xml:space="preserve">— nihai altın-standart kaydı. Sistem</w:t>
-      </w:r>
-      <w:r>
-        <w:t xml:space="preserve"> </w:t>
-      </w:r>
-      <w:r>
-        <w:rPr>
-          <w:b/>
-        </w:rPr>
-        <w:t xml:space="preserve">kendini geliştirir</w:t>
-      </w:r>
-      <w:r>
-        <w:t xml:space="preserve">: her L5 düzeltmesi bir eğitim sinyali olarak geri akar, böylece zamanla yapay zekâ daha fazlasını kendi başına halleder ve makale başına maliyet düşer — manuel derlemenin asla yapamayacağı bir şey. Uygulamamız, tek bir Supabase Postgres veritabanı üzerinde üç yüzeyli tek bir sistemdir: bir</w:t>
-      </w:r>
-      <w:r>
-        <w:t xml:space="preserve"> </w:t>
-      </w:r>
-      <w:r>
-        <w:rPr>
-          <w:b/>
-        </w:rPr>
-        <w:t xml:space="preserve">Python keşif &amp; çıkarım hattı</w:t>
-      </w:r>
-      <w:r>
-        <w:t xml:space="preserve"> </w:t>
-      </w:r>
-      <w:r>
-        <w:t xml:space="preserve">(Arciel — literatürü tarar, PDF’leri indirir, çalışan üç aşamalı bir YZ kademesi çalıştırır: günde ~1.500 makalede ucuz eleme → orta ayıklama → en iyi ~20 makalede güçlü bir PDF modeli = L1–L4), bir</w:t>
-      </w:r>
-      <w:r>
-        <w:t xml:space="preserve"> </w:t>
-      </w:r>
-      <w:r>
-        <w:rPr>
-          <w:b/>
-        </w:rPr>
-        <w:t xml:space="preserve">Supabase veritabanı sözleşmesi</w:t>
-      </w:r>
-      <w:r>
-        <w:t xml:space="preserve"> </w:t>
-      </w:r>
-      <w:r>
-        <w:t xml:space="preserve">(Arciel — değiştirilemez saklama, satır düzeyi güvenlik, inceleme iş akışı) ve</w:t>
-      </w:r>
-      <w:r>
-        <w:t xml:space="preserve"> </w:t>
-      </w:r>
-      <w:r>
-        <w:rPr>
-          <w:b/>
-        </w:rPr>
-        <w:t xml:space="preserve">uzman-etiketleyici web uygulaması</w:t>
-      </w:r>
-      <w:r>
-        <w:t xml:space="preserve"> </w:t>
-      </w:r>
-      <w:r>
-        <w:t xml:space="preserve">(benim frontend’im) —</w:t>
-      </w:r>
-      <w:r>
-        <w:t xml:space="preserve"> </w:t>
-      </w:r>
-      <w:r>
-        <w:rPr>
-          <w:b/>
-        </w:rPr>
-        <w:t xml:space="preserve">Layer 5, insan-doğrulama katmanı; bu belgenin geri kalanı bununla ilgilidir.</w:t>
-      </w:r>
-    </w:p>
-    <w:p>
-      <w:pPr>
-        <w:pStyle w:val="Heading2"/>
-      </w:pPr>
-      <w:bookmarkStart w:id="37" w:name="Xe635e9e2c29e922ee6923ad5030b1f8817fdde0"/>
-      <w:r>
-        <w:t xml:space="preserve">3. Benim parçam ne, neden gerekli ve neyi yaptım?</w:t>
-      </w:r>
-      <w:bookmarkEnd w:id="37"/>
-    </w:p>
-    <w:p>
-      <w:pPr>
-        <w:pStyle w:val="FirstParagraph"/>
-      </w:pPr>
-      <w:r>
-        <w:rPr>
-          <w:b/>
-        </w:rPr>
-        <w:t xml:space="preserve">Benim parçam, uzman-etiketleyici frontend’inin tamamı</w:t>
-      </w:r>
-      <w:r>
-        <w:t xml:space="preserve"> </w:t>
-      </w:r>
-      <w:r>
-        <w:t xml:space="preserve">— her doğrulayıcının ve onaylayıcının kullandığı,</w:t>
-      </w:r>
-      <w:r>
-        <w:t xml:space="preserve"> </w:t>
-      </w:r>
-      <w:r>
-        <w:rPr>
-          <w:b/>
-        </w:rPr>
-        <w:t xml:space="preserve">Vercel</w:t>
-      </w:r>
-      <w:r>
-        <w:t xml:space="preserve">’de yayında olan</w:t>
-      </w:r>
-      <w:r>
-        <w:t xml:space="preserve"> </w:t>
-      </w:r>
-      <w:r>
-        <w:rPr>
-          <w:b/>
-        </w:rPr>
-        <w:t xml:space="preserve">React 19 + Vite</w:t>
-      </w:r>
-      <w:r>
-        <w:t xml:space="preserve"> </w:t>
-      </w:r>
-      <w:r>
-        <w:t xml:space="preserve">uygulaması. OpenNutri’nin tasarımında bu,</w:t>
-      </w:r>
-      <w:r>
-        <w:t xml:space="preserve"> </w:t>
-      </w:r>
-      <w:r>
-        <w:rPr>
-          <w:b/>
-        </w:rPr>
-        <w:t xml:space="preserve">Layer 5 — Uzman İnsan Doğrulaması,</w:t>
-      </w:r>
-      <w:r>
-        <w:rPr>
-          <w:b/>
-        </w:rPr>
-        <w:t xml:space="preserve"> </w:t>
-      </w:r>
-      <w:r>
-        <w:rPr>
-          <w:b/>
-        </w:rPr>
-        <w:t xml:space="preserve">“</w:t>
-      </w:r>
-      <w:r>
-        <w:rPr>
-          <w:b/>
-        </w:rPr>
-        <w:t xml:space="preserve">Altın Standart</w:t>
-      </w:r>
-      <w:r>
-        <w:rPr>
-          <w:b/>
-        </w:rPr>
-        <w:t xml:space="preserve">”</w:t>
-      </w:r>
-      <w:r>
-        <w:rPr>
-          <w:b/>
-        </w:rPr>
-        <w:t xml:space="preserve"> </w:t>
-      </w:r>
-      <w:r>
-        <w:rPr>
-          <w:b/>
-        </w:rPr>
-        <w:t xml:space="preserve">katmanıdır.</w:t>
-      </w:r>
-    </w:p>
-    <w:p>
-      <w:pPr>
-        <w:pStyle w:val="BodyText"/>
-      </w:pPr>
-      <w:r>
-        <w:rPr>
-          <w:b/>
-        </w:rPr>
-        <w:t xml:space="preserve">Neden gerekli: manuel veri girişini doğrulamayla değiştirir.</w:t>
-      </w:r>
-      <w:r>
-        <w:t xml:space="preserve"> </w:t>
-      </w:r>
-      <w:r>
-        <w:t xml:space="preserve">Mevcut her veritabanı bir uzmanın manuel girişiyle kurulur — makaleyi oku, tabloyu bul, birimleri çöz, her sayıyı yaz. Benim frontend’im bu darboğazı üç şekilde kırar:</w:t>
+        <w:t xml:space="preserve">’yi kurduk: her makaleyi sıfırdan bir insanın okuması yerine,</w:t>
+      </w:r>
+      <w:r>
+        <w:t xml:space="preserve"> </w:t>
+      </w:r>
+      <w:r>
+        <w:rPr>
+          <w:b/>
+        </w:rPr>
+        <w:t xml:space="preserve">yapay zekâ okuyup sayıları önerir, insan ise yalnızca doğrular.</w:t>
+      </w:r>
+      <w:r>
+        <w:t xml:space="preserve"> </w:t>
+      </w:r>
+      <w:r>
+        <w:t xml:space="preserve">Üç parçaya ayrılır:</w:t>
       </w:r>
     </w:p>
     <w:p>
@@ -5883,91 +4686,28 @@
         <w:rPr>
           <w:b/>
         </w:rPr>
-        <w:t xml:space="preserve">“</w:t>
-      </w:r>
-      <w:r>
-        <w:rPr>
-          <w:b/>
-        </w:rPr>
-        <w:t xml:space="preserve">Sıfırdan kopyalama</w:t>
-      </w:r>
-      <w:r>
-        <w:rPr>
-          <w:b/>
-        </w:rPr>
-        <w:t xml:space="preserve">”</w:t>
-      </w:r>
-      <w:r>
-        <w:rPr>
-          <w:b/>
-        </w:rPr>
-        <w:t xml:space="preserve">yı</w:t>
-      </w:r>
-      <w:r>
-        <w:rPr>
-          <w:b/>
-        </w:rPr>
-        <w:t xml:space="preserve"> </w:t>
-      </w:r>
-      <w:r>
-        <w:rPr>
-          <w:b/>
-        </w:rPr>
-        <w:t xml:space="preserve">“</w:t>
-      </w:r>
-      <w:r>
-        <w:rPr>
-          <w:b/>
-        </w:rPr>
-        <w:t xml:space="preserve">taslağı gözden geçirme</w:t>
-      </w:r>
-      <w:r>
-        <w:rPr>
-          <w:b/>
-        </w:rPr>
-        <w:t xml:space="preserve">”</w:t>
-      </w:r>
-      <w:r>
-        <w:rPr>
-          <w:b/>
-        </w:rPr>
-        <w:t xml:space="preserve">ye dönüştürür.</w:t>
-      </w:r>
-      <w:r>
-        <w:t xml:space="preserve"> </w:t>
-      </w:r>
-      <w:r>
-        <w:t xml:space="preserve">Yalnızca yapay zekânın güveninin</w:t>
-      </w:r>
-      <w:r>
-        <w:t xml:space="preserve"> </w:t>
-      </w:r>
-      <w:r>
-        <w:rPr>
-          <w:b/>
-        </w:rPr>
-        <w:t xml:space="preserve">düşük</w:t>
-      </w:r>
-      <w:r>
-        <w:t xml:space="preserve"> </w:t>
-      </w:r>
-      <w:r>
-        <w:t xml:space="preserve">olduğu makaleler bir insana yönlendirilir — kademe, kıt uzman zamanını her şeye değil, tam olarak YZ’nin emin olmadığı yere harcar. Bir makale ekrana geldiğinde YZ onu çoktan bulmuş, okumuş ve aday değerleri doldurmuştur; uzman kopyalamak yerine</w:t>
-      </w:r>
-      <w:r>
-        <w:t xml:space="preserve"> </w:t>
-      </w:r>
-      <w:r>
-        <w:rPr>
-          <w:b/>
-        </w:rPr>
-        <w:t xml:space="preserve">doğrular ve düzeltir</w:t>
-      </w:r>
-      <w:r>
-        <w:t xml:space="preserve"> </w:t>
-      </w:r>
-      <w:r>
-        <w:t xml:space="preserve">— saatte birkaç makale ile bu projenin ihtiyaç duyduğu günde ~8–12 doğrulanmış makale arasındaki fark.</w:t>
+        <w:t xml:space="preserve">Bir backend hattı</w:t>
+      </w:r>
+      <w:r>
+        <w:t xml:space="preserve"> </w:t>
+      </w:r>
+      <w:r>
+        <w:t xml:space="preserve">(Arciel) — ilgili makaleleri bulur, PDF’leri indirir ve üzerlerinde yapay zekâ modelleri çalıştırarak</w:t>
+      </w:r>
+      <w:r>
+        <w:t xml:space="preserve"> </w:t>
+      </w:r>
+      <w:r>
+        <w:rPr>
+          <w:i/>
+        </w:rPr>
+        <w:t xml:space="preserve">aday</w:t>
+      </w:r>
+      <w:r>
+        <w:t xml:space="preserve"> </w:t>
+      </w:r>
+      <w:r>
+        <w:t xml:space="preserve">besin değerleri üretir.</w:t>
       </w:r>
     </w:p>
     <w:p>
@@ -5982,43 +4722,13 @@
         <w:rPr>
           <w:b/>
         </w:rPr>
-        <w:t xml:space="preserve">Kanıtı manuel bir aramadan anlık hâle getirir.</w:t>
-      </w:r>
-      <w:r>
-        <w:t xml:space="preserve"> </w:t>
-      </w:r>
-      <w:r>
-        <w:t xml:space="preserve">Manuel girişte en yavaş ve en hataya açık adım, 15 sayfalık bir PDF’te doğru değeri</w:t>
-      </w:r>
-      <w:r>
-        <w:t xml:space="preserve"> </w:t>
-      </w:r>
-      <w:r>
-        <w:rPr>
-          <w:i/>
-        </w:rPr>
-        <w:t xml:space="preserve">bulmak</w:t>
-      </w:r>
-      <w:r>
-        <w:t xml:space="preserve"> </w:t>
-      </w:r>
-      <w:r>
-        <w:t xml:space="preserve">ve doğru satır/sütun/birim olduğundan emin olmaktır. Arayüzüm</w:t>
-      </w:r>
-      <w:r>
-        <w:t xml:space="preserve"> </w:t>
-      </w:r>
-      <w:r>
-        <w:rPr>
-          <w:b/>
-        </w:rPr>
-        <w:t xml:space="preserve">bir değerin geldiği tam tabloyu veya cümleyi</w:t>
-      </w:r>
-      <w:r>
-        <w:t xml:space="preserve"> </w:t>
-      </w:r>
-      <w:r>
-        <w:t xml:space="preserve">aydınlatır ve içindeki besin adlarını tıklanabilir yapar; böylece uzmanın gözü doğrudan kanıta gider, aramak yerine onaylar. En zor işimin, PDF kanıt motorunun, var olmak zorunda olmasının nedeni budur.</w:t>
+        <w:t xml:space="preserve">Bir veritabanı</w:t>
+      </w:r>
+      <w:r>
+        <w:t xml:space="preserve"> </w:t>
+      </w:r>
+      <w:r>
+        <w:t xml:space="preserve">(Arciel) — her şeyi saklar ve inceleme iş akışını yürütür.</w:t>
       </w:r>
     </w:p>
     <w:p>
@@ -6033,96 +4743,49 @@
         <w:rPr>
           <w:b/>
         </w:rPr>
-        <w:t xml:space="preserve">Uzman-doğrulamalı, altın-standart gerçeğin — ve eğitim sinyalinin — üretildiği tek yerdir.</w:t>
-      </w:r>
-      <w:r>
-        <w:t xml:space="preserve"> </w:t>
-      </w:r>
-      <w:r>
-        <w:t xml:space="preserve">Manuel giriş bir sayı üretir, başka bir şey değil; arayüzüm bir sayı</w:t>
-      </w:r>
-      <w:r>
-        <w:t xml:space="preserve"> </w:t>
-      </w:r>
-      <w:r>
-        <w:rPr>
-          <w:b/>
-        </w:rPr>
-        <w:t xml:space="preserve">artı</w:t>
-      </w:r>
-      <w:r>
-        <w:t xml:space="preserve"> </w:t>
-      </w:r>
-      <w:r>
-        <w:t xml:space="preserve">YZ’yi yeniden eğiten, hata-kategorili bir düzeltme</w:t>
-      </w:r>
-      <w:r>
-        <w:t xml:space="preserve"> </w:t>
-      </w:r>
-      <w:r>
-        <w:rPr>
-          <w:b/>
-        </w:rPr>
-        <w:t xml:space="preserve">artı</w:t>
-      </w:r>
-      <w:r>
-        <w:t xml:space="preserve"> </w:t>
-      </w:r>
-      <w:r>
-        <w:t xml:space="preserve">otomatik DOI kökeni</w:t>
-      </w:r>
-      <w:r>
-        <w:t xml:space="preserve"> </w:t>
-      </w:r>
-      <w:r>
-        <w:rPr>
-          <w:b/>
-        </w:rPr>
-        <w:t xml:space="preserve">artı</w:t>
-      </w:r>
-      <w:r>
-        <w:t xml:space="preserve"> </w:t>
-      </w:r>
-      <w:r>
-        <w:t xml:space="preserve">projenin % 0,5 altı hata çıtasının arkasındaki değiştirilemez denetim kaydı üretir.</w:t>
-      </w:r>
+        <w:t xml:space="preserve">Etiketleyici web uygulaması</w:t>
+      </w:r>
+      <w:r>
+        <w:t xml:space="preserve"> </w:t>
+      </w:r>
+      <w:r>
+        <w:t xml:space="preserve">(benim frontend’im) — bir insanın bu aday değerleri kontrol edip düzelttiği yer.</w:t>
+      </w:r>
+      <w:r>
+        <w:t xml:space="preserve"> </w:t>
+      </w:r>
+      <w:r>
+        <w:rPr>
+          <w:b/>
+        </w:rPr>
+        <w:t xml:space="preserve">Benim kurduğum parça budur ve bu belgenin geri kalanı bununla ilgilidir.</w:t>
+      </w:r>
+    </w:p>
+    <w:p>
+      <w:pPr>
+        <w:pStyle w:val="Heading2"/>
+      </w:pPr>
+      <w:bookmarkStart w:id="37" w:name="Xe635e9e2c29e922ee6923ad5030b1f8817fdde0"/>
+      <w:r>
+        <w:t xml:space="preserve">3. Benim parçam ne, neden gerekli ve neyi yaptım?</w:t>
+      </w:r>
+      <w:bookmarkEnd w:id="37"/>
     </w:p>
     <w:p>
       <w:pPr>
         <w:pStyle w:val="FirstParagraph"/>
       </w:pPr>
       <w:r>
-        <w:t xml:space="preserve">Kısacası:</w:t>
-      </w:r>
-      <w:r>
-        <w:t xml:space="preserve"> </w:t>
-      </w:r>
-      <w:r>
-        <w:rPr>
-          <w:b/>
-        </w:rPr>
-        <w:t xml:space="preserve">manuel veri girişi ne ölçeklenir ne de gelişir; benim kurduğum doğrulama arayüzü ikisini de yapar</w:t>
-      </w:r>
-      <w:r>
-        <w:t xml:space="preserve"> </w:t>
-      </w:r>
-      <w:r>
-        <w:t xml:space="preserve">— ve bunu, projenin</w:t>
-      </w:r>
-      <w:r>
-        <w:t xml:space="preserve"> </w:t>
-      </w:r>
-      <w:r>
-        <w:rPr>
-          <w:b/>
-        </w:rPr>
-        <w:t xml:space="preserve">ücretsiz katman</w:t>
-      </w:r>
-      <w:r>
-        <w:t xml:space="preserve"> </w:t>
-      </w:r>
-      <w:r>
-        <w:t xml:space="preserve">veri limitleri (Supabase, Vercel) içinde, yine de anlık hissettirerek yapması gerekti.</w:t>
+        <w:rPr>
+          <w:b/>
+        </w:rPr>
+        <w:t xml:space="preserve">Benim parçam, etiketleyici frontend’inin tamamı</w:t>
+      </w:r>
+      <w:r>
+        <w:t xml:space="preserve"> </w:t>
+      </w:r>
+      <w:r>
+        <w:t xml:space="preserve">— her doğrulayıcının, yapay zekânın ham tahminlerini güvenilir veriye dönüştürmek için kullandığı React uygulaması (Vercel’de yayında).</w:t>
       </w:r>
     </w:p>
     <w:p>
@@ -6133,25 +4796,66 @@
         <w:rPr>
           <w:b/>
         </w:rPr>
+        <w:t xml:space="preserve">Neden gerekli.</w:t>
+      </w:r>
+      <w:r>
+        <w:t xml:space="preserve"> </w:t>
+      </w:r>
+      <w:r>
+        <w:t xml:space="preserve">O olmadan, bir uzmanın eski manuel işi yapması gerekirdi: tüm makaleyi oku, doğru tabloyu bul ve her sayıyı yaz. Benim uygulamam işin birimini</w:t>
+      </w:r>
+      <w:r>
+        <w:t xml:space="preserve"> </w:t>
+      </w:r>
+      <w:r>
+        <w:rPr>
+          <w:i/>
+        </w:rPr>
+        <w:t xml:space="preserve">kopyalamaktan</w:t>
+      </w:r>
+      <w:r>
+        <w:t xml:space="preserve"> </w:t>
+      </w:r>
+      <w:r>
+        <w:rPr>
+          <w:i/>
+        </w:rPr>
+        <w:t xml:space="preserve">doğrulamaya</w:t>
+      </w:r>
+      <w:r>
+        <w:t xml:space="preserve"> </w:t>
+      </w:r>
+      <w:r>
+        <w:t xml:space="preserve">çevirir. Makale, yapay zekânın değerleriyle önceden doldurulmuş gelir ve — işin özü budur —</w:t>
+      </w:r>
+      <w:r>
+        <w:t xml:space="preserve"> </w:t>
+      </w:r>
+      <w:r>
+        <w:rPr>
+          <w:b/>
+        </w:rPr>
+        <w:t xml:space="preserve">her değerin geldiği tam tablo veya cümle PDF üzerinde aydınlanır</w:t>
+      </w:r>
+      <w:r>
+        <w:t xml:space="preserve">, içindeki besin adları tıklanabilirdir; böylece uzmanın gözü doğrudan kanıta gider ve aramak yerine onaylar. Bir doğrulayıcıyı değecek kadar hızlı yapan şey budur (ve yapay zekânın en az emin olduğu vakalar, tam da bir insanın baktığı vakalardır). Her düzeltme ayrıca zamanla yapay zekâyı iyileştirmek için geri beslenir.</w:t>
+      </w:r>
+    </w:p>
+    <w:p>
+      <w:pPr>
+        <w:pStyle w:val="BodyText"/>
+      </w:pPr>
+      <w:r>
+        <w:rPr>
+          <w:b/>
+        </w:rPr>
         <w:t xml:space="preserve">Ne yaptığım, tek cümlede:</w:t>
       </w:r>
       <w:r>
         <w:t xml:space="preserve"> </w:t>
       </w:r>
       <w:r>
-        <w:t xml:space="preserve">Bir etiketleyicinin bir makaleyi açtığı ve</w:t>
-      </w:r>
-      <w:r>
-        <w:t xml:space="preserve"> </w:t>
-      </w:r>
-      <w:r>
-        <w:rPr>
-          <w:b/>
-        </w:rPr>
-        <w:t xml:space="preserve">bir değerin geldiği tam tablonun veya paragrafın PDF üzerinde aydınlandığı</w:t>
-      </w:r>
-      <w:r>
-        <w:t xml:space="preserve">, besin adlarının tıklanabilir hâle geldiği, bir tıklamanın değeri editöre düşürdüğü, bağışlayıcı aramanın onu kanonik gıda/besin kataloğuna eşlediği ve doğrulanmış gönderinin saklandığı çalışma alanını kurdum — hepsi istemci tarafında, keyfi yayıncı PDF’leri üzerinde, bütün gün yapılabilecek kadar hızlı. Somut olarak yedi şeyin sahibiyim; bir sonraki bölüm bunları tek tek anlatıyor:</w:t>
+        <w:t xml:space="preserve">Bir etiketleyicinin bir makaleyi açtığı, her değerin kaynağının PDF üzerinde aydınlandığı, bir tıklamanın değeri editöre düşürdüğü, bağışlayıcı aramanın serbest metni gıda/besin kataloğuna eşlediği ve tamamlanan gönderinin saklandığı çalışma alanını kurdum — hepsi tarayıcıda, keyfi yayıncı PDF’leri üzerinde, bütün gün yapılabilecek kadar hızlı. Somut olarak yedi şeyin sahibiyim; bir sonraki bölüm bunları tek tek anlatıyor:</w:t>
       </w:r>
     </w:p>
     <w:p>
@@ -9743,7 +8447,7 @@
         <w:rPr>
           <w:b/>
         </w:rPr>
-        <w:t xml:space="preserve">Layer 5, uzman-doğrulama katmanını.</w:t>
+        <w:t xml:space="preserve">uzman-doğrulama katmanını.</w:t>
       </w:r>
       <w:r>
         <w:t xml:space="preserve"> </w:t>
@@ -10375,34 +9079,7 @@
     <w:abstractNumId w:val="991"/>
   </w:num>
   <w:num w:numId="1002">
-    <w:abstractNumId w:val="99411"/>
-    <w:lvlOverride w:ilvl="0">
-      <w:startOverride w:val="1"/>
-    </w:lvlOverride>
-    <w:lvlOverride w:ilvl="1">
-      <w:startOverride w:val="1"/>
-    </w:lvlOverride>
-    <w:lvlOverride w:ilvl="2">
-      <w:startOverride w:val="1"/>
-    </w:lvlOverride>
-    <w:lvlOverride w:ilvl="3">
-      <w:startOverride w:val="1"/>
-    </w:lvlOverride>
-    <w:lvlOverride w:ilvl="4">
-      <w:startOverride w:val="1"/>
-    </w:lvlOverride>
-    <w:lvlOverride w:ilvl="5">
-      <w:startOverride w:val="1"/>
-    </w:lvlOverride>
-    <w:lvlOverride w:ilvl="6">
-      <w:startOverride w:val="1"/>
-    </w:lvlOverride>
-    <w:lvlOverride w:ilvl="7">
-      <w:startOverride w:val="1"/>
-    </w:lvlOverride>
-    <w:lvlOverride w:ilvl="8">
-      <w:startOverride w:val="1"/>
-    </w:lvlOverride>
+    <w:abstractNumId w:val="991"/>
   </w:num>
   <w:num w:numId="1003">
     <w:abstractNumId w:val="99411"/>
@@ -10474,34 +9151,7 @@
     <w:abstractNumId w:val="991"/>
   </w:num>
   <w:num w:numId="1008">
-    <w:abstractNumId w:val="99411"/>
-    <w:lvlOverride w:ilvl="0">
-      <w:startOverride w:val="1"/>
-    </w:lvlOverride>
-    <w:lvlOverride w:ilvl="1">
-      <w:startOverride w:val="1"/>
-    </w:lvlOverride>
-    <w:lvlOverride w:ilvl="2">
-      <w:startOverride w:val="1"/>
-    </w:lvlOverride>
-    <w:lvlOverride w:ilvl="3">
-      <w:startOverride w:val="1"/>
-    </w:lvlOverride>
-    <w:lvlOverride w:ilvl="4">
-      <w:startOverride w:val="1"/>
-    </w:lvlOverride>
-    <w:lvlOverride w:ilvl="5">
-      <w:startOverride w:val="1"/>
-    </w:lvlOverride>
-    <w:lvlOverride w:ilvl="6">
-      <w:startOverride w:val="1"/>
-    </w:lvlOverride>
-    <w:lvlOverride w:ilvl="7">
-      <w:startOverride w:val="1"/>
-    </w:lvlOverride>
-    <w:lvlOverride w:ilvl="8">
-      <w:startOverride w:val="1"/>
-    </w:lvlOverride>
+    <w:abstractNumId w:val="991"/>
   </w:num>
   <w:num w:numId="1009">
     <w:abstractNumId w:val="99411"/>

</xml_diff>

<commit_message>
Frame team solution as confidence-gated (Part 2)
Part 2 now states the AI proposes values with a confidence signal and only
low-confidence papers are routed to a human — the scaling argument that
makes the project's "at scale + correct" claim hold up under questioning.
Phrased as "flags low-confidence for review" to avoid over-claiming auto-write.
This is the locked template for Arciel's deck too (where routing is featured).

Co-Authored-By: Claude Opus 4.8 <noreply@anthropic.com>
</commit_message>
<xml_diff>
--- a/docs/defense/docx/Aysegul_Dogan_Presentation.docx
+++ b/docs/defense/docx/Aysegul_Dogan_Presentation.docx
@@ -403,22 +403,19 @@
         <w:t xml:space="preserve">OpenNutri</w:t>
       </w:r>
       <w:r>
-        <w:t xml:space="preserve">: instead of a person reading each paper from scratch,</w:t>
-      </w:r>
-      <w:r>
-        <w:t xml:space="preserve"> </w:t>
-      </w:r>
-      <w:r>
-        <w:rPr>
-          <w:b/>
-        </w:rPr>
-        <w:t xml:space="preserve">the AI does the reading and proposes the numbers, and a person only verifies them.</w:t>
-      </w:r>
-      <w:r>
-        <w:t xml:space="preserve"> </w:t>
-      </w:r>
-      <w:r>
-        <w:t xml:space="preserve">It splits into three parts:</w:t>
+        <w:t xml:space="preserve">: the AI reads each paper and proposes the numbers</w:t>
+      </w:r>
+      <w:r>
+        <w:t xml:space="preserve"> </w:t>
+      </w:r>
+      <w:r>
+        <w:rPr>
+          <w:b/>
+        </w:rPr>
+        <w:t xml:space="preserve">with a confidence signal</w:t>
+      </w:r>
+      <w:r>
+        <w:t xml:space="preserve">, and only the papers it is unsure about are routed to a human to verify and correct. That is what lets the system scale — experts spend their time only on the hard cases — while keeping the data trustworthy. It splits into three parts:</w:t>
       </w:r>
     </w:p>
     <w:p>
@@ -439,7 +436,7 @@
         <w:t xml:space="preserve"> </w:t>
       </w:r>
       <w:r>
-        <w:t xml:space="preserve">(Arciel) that finds relevant papers, downloads the PDFs, and runs AI models over them to produce</w:t>
+        <w:t xml:space="preserve">(Arciel) that finds relevant papers, downloads the PDFs, runs AI models over them to produce</w:t>
       </w:r>
       <w:r>
         <w:t xml:space="preserve"> </w:t>
@@ -454,7 +451,7 @@
         <w:t xml:space="preserve"> </w:t>
       </w:r>
       <w:r>
-        <w:t xml:space="preserve">nutrient values.</w:t>
+        <w:t xml:space="preserve">nutrient values, and flags the low-confidence ones for human review.</w:t>
       </w:r>
     </w:p>
     <w:p>
@@ -496,7 +493,7 @@
         <w:t xml:space="preserve"> </w:t>
       </w:r>
       <w:r>
-        <w:t xml:space="preserve">(my frontend) — where a human checks and corrects those candidate values.</w:t>
+        <w:t xml:space="preserve">(my frontend) — where a human verifies and corrects those flagged candidate values.</w:t>
       </w:r>
       <w:r>
         <w:t xml:space="preserve"> </w:t>
@@ -4656,22 +4653,22 @@
         <w:t xml:space="preserve">OpenNutri</w:t>
       </w:r>
       <w:r>
-        <w:t xml:space="preserve">’yi kurduk: her makaleyi sıfırdan bir insanın okuması yerine,</w:t>
-      </w:r>
-      <w:r>
-        <w:t xml:space="preserve"> </w:t>
-      </w:r>
-      <w:r>
-        <w:rPr>
-          <w:b/>
-        </w:rPr>
-        <w:t xml:space="preserve">yapay zekâ okuyup sayıları önerir, insan ise yalnızca doğrular.</w:t>
-      </w:r>
-      <w:r>
-        <w:t xml:space="preserve"> </w:t>
-      </w:r>
-      <w:r>
-        <w:t xml:space="preserve">Üç parçaya ayrılır:</w:t>
+        <w:t xml:space="preserve">’yi kurduk: yapay zekâ her makaleyi okur ve sayıları</w:t>
+      </w:r>
+      <w:r>
+        <w:t xml:space="preserve"> </w:t>
+      </w:r>
+      <w:r>
+        <w:rPr>
+          <w:b/>
+        </w:rPr>
+        <w:t xml:space="preserve">bir güven sinyaliyle birlikte</w:t>
+      </w:r>
+      <w:r>
+        <w:t xml:space="preserve"> </w:t>
+      </w:r>
+      <w:r>
+        <w:t xml:space="preserve">önerir; yalnızca emin olmadığı makaleler bir insana doğrulanıp düzeltilmek üzere yönlendirilir. Sistemin ölçeklenmesini sağlayan şey budur — uzmanlar zamanlarını yalnızca zor vakalara harcar — ve veri güvenilir kalır. Üç parçaya ayrılır:</w:t>
       </w:r>
     </w:p>
     <w:p>
@@ -4692,7 +4689,7 @@
         <w:t xml:space="preserve"> </w:t>
       </w:r>
       <w:r>
-        <w:t xml:space="preserve">(Arciel) — ilgili makaleleri bulur, PDF’leri indirir ve üzerlerinde yapay zekâ modelleri çalıştırarak</w:t>
+        <w:t xml:space="preserve">(Arciel) — ilgili makaleleri bulur, PDF’leri indirir, üzerlerinde yapay zekâ modelleri çalıştırarak</w:t>
       </w:r>
       <w:r>
         <w:t xml:space="preserve"> </w:t>
@@ -4707,7 +4704,7 @@
         <w:t xml:space="preserve"> </w:t>
       </w:r>
       <w:r>
-        <w:t xml:space="preserve">besin değerleri üretir.</w:t>
+        <w:t xml:space="preserve">besin değerleri üretir ve düşük-güvenli olanları insan incelemesine işaretler.</w:t>
       </w:r>
     </w:p>
     <w:p>
@@ -4749,7 +4746,7 @@
         <w:t xml:space="preserve"> </w:t>
       </w:r>
       <w:r>
-        <w:t xml:space="preserve">(benim frontend’im) — bir insanın bu aday değerleri kontrol edip düzelttiği yer.</w:t>
+        <w:t xml:space="preserve">(benim frontend’im) — bir insanın işaretlenen bu aday değerleri doğrulayıp düzelttiği yer.</w:t>
       </w:r>
       <w:r>
         <w:t xml:space="preserve"> </w:t>

</xml_diff>

<commit_message>
Revert Part 2 to concise frame; humans verify low-confidence papers
Drop the expanded confidence/scaling pitch (over-explained); restore the
prior short three-part version with one change — a person verifies the
papers the AI is unsure about, not every paper. EN + TR. DOCX re-exported.

Co-Authored-By: Claude Opus 4.8 <noreply@anthropic.com>
</commit_message>
<xml_diff>
--- a/docs/defense/docx/Aysegul_Dogan_Presentation.docx
+++ b/docs/defense/docx/Aysegul_Dogan_Presentation.docx
@@ -403,19 +403,22 @@
         <w:t xml:space="preserve">OpenNutri</w:t>
       </w:r>
       <w:r>
-        <w:t xml:space="preserve">: the AI reads each paper and proposes the numbers</w:t>
-      </w:r>
-      <w:r>
-        <w:t xml:space="preserve"> </w:t>
-      </w:r>
-      <w:r>
-        <w:rPr>
-          <w:b/>
-        </w:rPr>
-        <w:t xml:space="preserve">with a confidence signal</w:t>
-      </w:r>
-      <w:r>
-        <w:t xml:space="preserve">, and only the papers it is unsure about are routed to a human to verify and correct. That is what lets the system scale — experts spend their time only on the hard cases — while keeping the data trustworthy. It splits into three parts:</w:t>
+        <w:t xml:space="preserve">: instead of a person reading each paper from scratch,</w:t>
+      </w:r>
+      <w:r>
+        <w:t xml:space="preserve"> </w:t>
+      </w:r>
+      <w:r>
+        <w:rPr>
+          <w:b/>
+        </w:rPr>
+        <w:t xml:space="preserve">the AI does the reading and proposes the numbers, and a person verifies the ones the AI is unsure about.</w:t>
+      </w:r>
+      <w:r>
+        <w:t xml:space="preserve"> </w:t>
+      </w:r>
+      <w:r>
+        <w:t xml:space="preserve">It splits into three parts:</w:t>
       </w:r>
     </w:p>
     <w:p>
@@ -436,7 +439,7 @@
         <w:t xml:space="preserve"> </w:t>
       </w:r>
       <w:r>
-        <w:t xml:space="preserve">(Arciel) that finds relevant papers, downloads the PDFs, runs AI models over them to produce</w:t>
+        <w:t xml:space="preserve">(Arciel) that finds relevant papers, downloads the PDFs, and runs AI models over them to produce</w:t>
       </w:r>
       <w:r>
         <w:t xml:space="preserve"> </w:t>
@@ -451,7 +454,7 @@
         <w:t xml:space="preserve"> </w:t>
       </w:r>
       <w:r>
-        <w:t xml:space="preserve">nutrient values, and flags the low-confidence ones for human review.</w:t>
+        <w:t xml:space="preserve">nutrient values.</w:t>
       </w:r>
     </w:p>
     <w:p>
@@ -493,7 +496,7 @@
         <w:t xml:space="preserve"> </w:t>
       </w:r>
       <w:r>
-        <w:t xml:space="preserve">(my frontend) — where a human verifies and corrects those flagged candidate values.</w:t>
+        <w:t xml:space="preserve">(my frontend) — where a human checks and corrects those candidate values.</w:t>
       </w:r>
       <w:r>
         <w:t xml:space="preserve"> </w:t>
@@ -4653,22 +4656,22 @@
         <w:t xml:space="preserve">OpenNutri</w:t>
       </w:r>
       <w:r>
-        <w:t xml:space="preserve">’yi kurduk: yapay zekâ her makaleyi okur ve sayıları</w:t>
-      </w:r>
-      <w:r>
-        <w:t xml:space="preserve"> </w:t>
-      </w:r>
-      <w:r>
-        <w:rPr>
-          <w:b/>
-        </w:rPr>
-        <w:t xml:space="preserve">bir güven sinyaliyle birlikte</w:t>
-      </w:r>
-      <w:r>
-        <w:t xml:space="preserve"> </w:t>
-      </w:r>
-      <w:r>
-        <w:t xml:space="preserve">önerir; yalnızca emin olmadığı makaleler bir insana doğrulanıp düzeltilmek üzere yönlendirilir. Sistemin ölçeklenmesini sağlayan şey budur — uzmanlar zamanlarını yalnızca zor vakalara harcar — ve veri güvenilir kalır. Üç parçaya ayrılır:</w:t>
+        <w:t xml:space="preserve">’yi kurduk: her makaleyi sıfırdan bir insanın okuması yerine,</w:t>
+      </w:r>
+      <w:r>
+        <w:t xml:space="preserve"> </w:t>
+      </w:r>
+      <w:r>
+        <w:rPr>
+          <w:b/>
+        </w:rPr>
+        <w:t xml:space="preserve">yapay zekâ okuyup sayıları önerir, insan ise yapay zekânın emin olmadığı makaleleri doğrular.</w:t>
+      </w:r>
+      <w:r>
+        <w:t xml:space="preserve"> </w:t>
+      </w:r>
+      <w:r>
+        <w:t xml:space="preserve">Üç parçaya ayrılır:</w:t>
       </w:r>
     </w:p>
     <w:p>
@@ -4689,7 +4692,7 @@
         <w:t xml:space="preserve"> </w:t>
       </w:r>
       <w:r>
-        <w:t xml:space="preserve">(Arciel) — ilgili makaleleri bulur, PDF’leri indirir, üzerlerinde yapay zekâ modelleri çalıştırarak</w:t>
+        <w:t xml:space="preserve">(Arciel) — ilgili makaleleri bulur, PDF’leri indirir ve üzerlerinde yapay zekâ modelleri çalıştırarak</w:t>
       </w:r>
       <w:r>
         <w:t xml:space="preserve"> </w:t>
@@ -4704,7 +4707,7 @@
         <w:t xml:space="preserve"> </w:t>
       </w:r>
       <w:r>
-        <w:t xml:space="preserve">besin değerleri üretir ve düşük-güvenli olanları insan incelemesine işaretler.</w:t>
+        <w:t xml:space="preserve">besin değerleri üretir.</w:t>
       </w:r>
     </w:p>
     <w:p>
@@ -4746,7 +4749,7 @@
         <w:t xml:space="preserve"> </w:t>
       </w:r>
       <w:r>
-        <w:t xml:space="preserve">(benim frontend’im) — bir insanın işaretlenen bu aday değerleri doğrulayıp düzelttiği yer.</w:t>
+        <w:t xml:space="preserve">(benim frontend’im) — bir insanın bu aday değerleri kontrol edip düzelttiği yer.</w:t>
       </w:r>
       <w:r>
         <w:t xml:space="preserve"> </w:t>

</xml_diff>